<commit_message>
Upload completed documentation and PDF reports
</commit_message>
<xml_diff>
--- a/Documentation/Project Design Phase/Problem - Solution Fit Template/Problem - Solution Fit Template v1.docx
+++ b/Documentation/Project Design Phase/Problem - Solution Fit Template/Problem - Solution Fit Template v1.docx
@@ -85,7 +85,7 @@
           </w:tcPr>
           <w:p>
             <w:r>
-              <w:t>15 February 2025</w:t>
+              <w:t>26 June 2026</w:t>
             </w:r>
           </w:p>
         </w:tc>
@@ -105,7 +105,11 @@
           <w:tcPr>
             <w:tcW w:w="4508" w:type="dxa"/>
           </w:tcPr>
-          <w:p/>
+          <w:p>
+            <w:r>
+              <w:t>Solo</w:t>
+            </w:r>
+          </w:p>
         </w:tc>
       </w:tr>
       <w:tr>
@@ -123,7 +127,16 @@
           <w:tcPr>
             <w:tcW w:w="4508" w:type="dxa"/>
           </w:tcPr>
-          <w:p/>
+          <w:p>
+            <w:proofErr w:type="spellStart"/>
+            <w:r>
+              <w:t>ShopEZ</w:t>
+            </w:r>
+            <w:proofErr w:type="spellEnd"/>
+            <w:r>
+              <w:t xml:space="preserve"> – Ecommerce Application </w:t>
+            </w:r>
+          </w:p>
         </w:tc>
       </w:tr>
       <w:tr>
@@ -271,39 +284,57 @@
       </w:r>
     </w:p>
     <w:p>
+      <w:pPr>
+        <w:rPr>
+          <w:lang w:val="en-IN"/>
+        </w:rPr>
+      </w:pPr>
       <w:r>
         <w:rPr>
-          <w:noProof/>
+          <w:lang w:val="en-IN"/>
         </w:rPr>
         <w:drawing>
-          <wp:inline distT="0" distB="0" distL="0" distR="0" wp14:anchorId="554CABB7" wp14:editId="4033207E">
-            <wp:extent cx="5492750" cy="3441700"/>
-            <wp:effectExtent l="0" t="0" r="0" b="6350"/>
-            <wp:docPr id="2" name="image1.png" descr="Calendar&#10;&#10;Description automatically generated"/>
-            <wp:cNvGraphicFramePr/>
+          <wp:inline distT="0" distB="0" distL="0" distR="0" wp14:anchorId="01672C26" wp14:editId="3C189F03">
+            <wp:extent cx="5731510" cy="3820795"/>
+            <wp:effectExtent l="0" t="0" r="2540" b="8255"/>
+            <wp:docPr id="1452263992" name="Picture 2"/>
+            <wp:cNvGraphicFramePr>
+              <a:graphicFrameLocks xmlns:a="http://schemas.openxmlformats.org/drawingml/2006/main" noChangeAspect="1"/>
+            </wp:cNvGraphicFramePr>
             <a:graphic xmlns:a="http://schemas.openxmlformats.org/drawingml/2006/main">
               <a:graphicData uri="http://schemas.openxmlformats.org/drawingml/2006/picture">
                 <pic:pic xmlns:pic="http://schemas.openxmlformats.org/drawingml/2006/picture">
                   <pic:nvPicPr>
-                    <pic:cNvPr id="0" name="image1.png" descr="Calendar&#10;&#10;Description automatically generated"/>
-                    <pic:cNvPicPr preferRelativeResize="0"/>
+                    <pic:cNvPr id="0" name="Picture 6"/>
+                    <pic:cNvPicPr>
+                      <a:picLocks noChangeAspect="1" noChangeArrowheads="1"/>
+                    </pic:cNvPicPr>
                   </pic:nvPicPr>
                   <pic:blipFill>
-                    <a:blip r:embed="rId6"/>
+                    <a:blip r:embed="rId6" cstate="print">
+                      <a:extLst>
+                        <a:ext uri="{28A0092B-C50C-407E-A947-70E740481C1C}">
+                          <a14:useLocalDpi xmlns:a14="http://schemas.microsoft.com/office/drawing/2010/main" val="0"/>
+                        </a:ext>
+                      </a:extLst>
+                    </a:blip>
                     <a:srcRect/>
                     <a:stretch>
                       <a:fillRect/>
                     </a:stretch>
                   </pic:blipFill>
-                  <pic:spPr>
+                  <pic:spPr bwMode="auto">
                     <a:xfrm>
                       <a:off x="0" y="0"/>
-                      <a:ext cx="5492750" cy="3441700"/>
+                      <a:ext cx="5731510" cy="3820795"/>
                     </a:xfrm>
                     <a:prstGeom prst="rect">
                       <a:avLst/>
                     </a:prstGeom>
-                    <a:ln/>
+                    <a:noFill/>
+                    <a:ln>
+                      <a:noFill/>
+                    </a:ln>
                   </pic:spPr>
                 </pic:pic>
               </a:graphicData>
@@ -312,8 +343,10 @@
         </w:drawing>
       </w:r>
     </w:p>
+    <w:p/>
     <w:p>
       <w:r>
+        <w:lastRenderedPageBreak/>
         <w:t>References:</w:t>
       </w:r>
     </w:p>
@@ -1110,7 +1143,6 @@
   <w:style w:type="character" w:default="1" w:styleId="DefaultParagraphFont">
     <w:name w:val="Default Paragraph Font"/>
     <w:uiPriority w:val="1"/>
-    <w:semiHidden/>
     <w:unhideWhenUsed/>
   </w:style>
   <w:style w:type="table" w:default="1" w:styleId="TableNormal">

</xml_diff>